<commit_message>
Dijital icerikler Ekim 2026 e-icerik tablosuna gore gozden gecirildi: 11.2.2 tur/etiket duzeltildi, tablo turleri MEB terimleriyle yazildi, unite sonu dijital sorularina yapilandirilmis grid sorusu eklendi
</commit_message>
<xml_diff>
--- a/Kim11-2-2-Denge-Sureci.docx
+++ b/Kim11-2-2-Denge-Sureci.docx
@@ -4231,7 +4231,7 @@
           <w:rFonts w:ascii="Times New Roman" w:hAnsi="Times New Roman" w:cs="Times New Roman"/>
           <w:lang w:val="tr-TR"/>
         </w:rPr>
-        <w:t xml:space="preserve">Denge sürecinde ileri ve geri tepkime hızlarının değişimini gösteren animasyona ulaşmak için karekodu okutunuz.</w:t>
+        <w:t xml:space="preserve">Denge sürecinde ileri ve geri tepkime hızlarının değişimini inceleyip hız-zaman grafiğini çizebileceğiniz etkileşimli içeriğe ulaşmak için karekodu okutunuz.</w:t>
       </w:r>
     </w:p>
     <w:p>
@@ -4302,7 +4302,7 @@
                               <w:rPr>
                                 <w:lang w:val="tr-TR"/>
                               </w:rPr>
-                              <w:t>Karekod alanı: Animasyon (Kim11.2.2)</w:t>
+                              <w:t>Karekod alanı: Etkileşimli içerik (Kim11.2.2)</w:t>
                             </w:r>
                           </w:p>
                         </w:txbxContent>
@@ -4341,7 +4341,7 @@
                         <w:rPr>
                           <w:lang w:val="tr-TR"/>
                         </w:rPr>
-                        <w:t>Karekod alanı: Animasyon (Kim11.2.2)</w:t>
+                        <w:t>Karekod alanı: Etkileşimli içerik (Kim11.2.2)</w:t>
                       </w:r>
                     </w:p>
                   </w:txbxContent>

</xml_diff>